<commit_message>
Add README and writing guide; rework project 5 (Jacobi/inner-halo)
- Add README.md overview of the five 2026-27 projects and repo layout
- Add PROJECT_DESCRIPTION_GUIDE.md distilling the house style and template rules
- Project 5: reframe as a Gaia DR4 discovery search; retitle "Discovering...";
  rebuild the Background (IOM method + pre-Gaia -> Gaia harvest -> bar failure
  -> DR4); prose pass; draw [Fe/H] from Gaia+DESI+APOGEE+GALAH+LAMOST; add
  verified references (IOM/Gaia classics, DESI MWS, Gaia DR4)

Co-Authored-By: Claude Opus 4.8 <noreply@anthropic.com>
</commit_message>
<xml_diff>
--- a/05_Gaia_DR4_Inner_Halo_Substructure_Jacobi_Metallicity.docx
+++ b/05_Gaia_DR4_Inner_Halo_Substructure_Jacobi_Metallicity.docx
@@ -10,10 +10,7 @@
         </w:rPr>
       </w:pPr>
       <w:r>
-        <w:rPr>
-          <w:rFonts w:ascii="Arial" w:hAnsi="Arial" w:cs="Arial"/>
-        </w:rPr>
-        <w:t>Project Title: Archaeology in a Barred Galaxy: Inner-Halo Substructure with Gaia DR4, Jacobi Energy, and Chemistry</w:t>
+        <w:t>Project Title: Archaeology in a Barred Galaxy: Discovering Inner-Halo Substructure with Gaia DR4, Jacobi Energy, and Chemistry</w:t>
       </w:r>
     </w:p>
     <w:p>
@@ -94,146 +91,20 @@
         </w:rPr>
       </w:pPr>
       <w:r>
-        <w:rPr>
-          <w:rFonts w:ascii="Arial" w:hAnsi="Arial" w:cs="Arial"/>
-          <w:sz w:val="22"/>
-          <w:szCs w:val="22"/>
-        </w:rPr>
-        <w:t>The stellar halo was assembled from disrupted dwarf galaxies and star clusters. Their debris is usually sought as compact groups in orbital-energy and angular-momentum space, quantities that are conserved in a static, axisymmetric Milky Way. That approximation is weakest in the inner Galaxy. The rotating Galactic bar can smear genuine ancient substructure across conventional integrals-of-motion diagrams, making it resemble the smooth halo.</w:t>
-      </w:r>
-    </w:p>
-    <w:p>
-      <w:pPr>
-        <w:spacing w:before="40" w:after="0" w:line="360" w:lineRule="auto"/>
-        <w:rPr>
-          <w:rFonts w:ascii="Arial" w:hAnsi="Arial" w:cs="Arial"/>
-          <w:sz w:val="22"/>
-          <w:szCs w:val="22"/>
-        </w:rPr>
-      </w:pPr>
-      <w:r>
-        <w:rPr>
-          <w:rFonts w:ascii="Arial" w:hAnsi="Arial" w:cs="Arial"/>
-          <w:sz w:val="22"/>
-          <w:szCs w:val="22"/>
-        </w:rPr>
-        <w:t xml:space="preserve">This project starts from an existing Python/AGAMA framework and searches for hidden inner-halo substructure in a space adapted to a rotating potential: Jacobi energy, </w:t>
-      </w:r>
-      <w:r>
-        <w:rPr>
-          <w:rFonts w:ascii="Arial" w:hAnsi="Arial" w:cs="Arial"/>
-          <w:sz w:val="22"/>
-          <w:szCs w:val="22"/>
-          <w:i/>
-          <w:iCs/>
-        </w:rPr>
-        <w:t>H</w:t>
-      </w:r>
-      <w:r>
-        <w:rPr>
-          <w:rFonts w:ascii="Arial" w:hAnsi="Arial" w:cs="Arial"/>
-          <w:sz w:val="22"/>
-          <w:szCs w:val="22"/>
-          <w:i/>
-          <w:iCs/>
-          <w:vertAlign w:val="subscript"/>
-        </w:rPr>
-        <w:t>J</w:t>
-      </w:r>
-      <w:r>
-        <w:rPr>
-          <w:rFonts w:ascii="Arial" w:hAnsi="Arial" w:cs="Arial"/>
-          <w:sz w:val="22"/>
-          <w:szCs w:val="22"/>
-        </w:rPr>
-        <w:t xml:space="preserve"> = E − </w:t>
-      </w:r>
-      <w:r>
-        <w:rPr>
-          <w:rFonts w:ascii="Arial" w:hAnsi="Arial" w:cs="Arial"/>
-          <w:sz w:val="22"/>
-          <w:szCs w:val="22"/>
-          <w:i/>
-          <w:iCs/>
-        </w:rPr>
-        <w:t>Ω</w:t>
-      </w:r>
-      <w:r>
-        <w:rPr>
-          <w:rFonts w:ascii="Arial" w:hAnsi="Arial" w:cs="Arial"/>
-          <w:sz w:val="22"/>
-          <w:szCs w:val="22"/>
-          <w:i/>
-          <w:iCs/>
-          <w:vertAlign w:val="subscript"/>
-        </w:rPr>
-        <w:t>b</w:t>
-      </w:r>
-      <w:r>
-        <w:rPr>
-          <w:rFonts w:ascii="Arial" w:hAnsi="Arial" w:cs="Arial"/>
-          <w:sz w:val="22"/>
-          <w:szCs w:val="22"/>
-        </w:rPr>
-        <w:t xml:space="preserve"> </w:t>
-      </w:r>
-      <w:r>
-        <w:rPr>
-          <w:rFonts w:ascii="Arial" w:hAnsi="Arial" w:cs="Arial"/>
-          <w:sz w:val="22"/>
-          <w:szCs w:val="22"/>
-          <w:i/>
-          <w:iCs/>
-        </w:rPr>
-        <w:t>L</w:t>
-      </w:r>
-      <w:r>
-        <w:rPr>
-          <w:rFonts w:ascii="Arial" w:hAnsi="Arial" w:cs="Arial"/>
-          <w:sz w:val="22"/>
-          <w:szCs w:val="22"/>
-          <w:i/>
-          <w:iCs/>
-          <w:vertAlign w:val="subscript"/>
-        </w:rPr>
-        <w:t>z</w:t>
-      </w:r>
-      <w:r>
-        <w:rPr>
-          <w:rFonts w:ascii="Arial" w:hAnsi="Arial" w:cs="Arial"/>
-          <w:sz w:val="22"/>
-          <w:szCs w:val="22"/>
-        </w:rPr>
-        <w:t xml:space="preserve">, combined with metallicity. A tested contrastive-entropy statistic will quantify which bar pattern speeds, if any, make the observed </w:t>
-      </w:r>
-      <w:r>
-        <w:rPr>
-          <w:rFonts w:ascii="Arial" w:hAnsi="Arial" w:cs="Arial"/>
-          <w:sz w:val="22"/>
-          <w:szCs w:val="22"/>
-          <w:i/>
-          <w:iCs/>
-        </w:rPr>
-        <w:t>H</w:t>
-      </w:r>
-      <w:r>
-        <w:rPr>
-          <w:rFonts w:ascii="Arial" w:hAnsi="Arial" w:cs="Arial"/>
-          <w:sz w:val="22"/>
-          <w:szCs w:val="22"/>
-          <w:i/>
-          <w:iCs/>
-          <w:vertAlign w:val="subscript"/>
-        </w:rPr>
-        <w:t>J</w:t>
-      </w:r>
-      <w:r>
-        <w:rPr>
-          <w:rFonts w:ascii="Arial" w:hAnsi="Arial" w:cs="Arial"/>
-          <w:sz w:val="22"/>
-          <w:szCs w:val="22"/>
-        </w:rPr>
-        <w:t>–[Fe/H] distribution more structured than permutation nulls. Mocks, realistic error propagation, and a separate membership stage will determine whether any detected chemo-dynamical structure represents ancient debris rather than noise, selection effects, or bar resonances.</w:t>
+        <w:t>The Milky Way built its stellar halo by tearing apart dwarf galaxies and star clusters. Astronomers hunt the debris as tight clumps in orbital energy and angular momentum, E and Lz — quantities the Galaxy conserves only while it stays smooth and unchanging. In the inner Galaxy it does neither. There the rotating bar smears ancient debris across the E–Lz plane by factors of ten to a hundred (Dillamore &amp; Sanders 2025), until the clumps dissolve into the smooth halo. The same study supplies the cure. The Jacobi integral HJ = E − Ωb Lz survives the bar: it holds exactly when the bar turns steadily, and holds well even as the bar slows. Joined to stellar chemistry, HJ recovers the structure that E–Lz loses.</w:t>
+      </w:r>
+    </w:p>
+    <w:p>
+      <w:pPr>
+        <w:spacing w:before="40" w:after="0" w:line="360" w:lineRule="auto"/>
+        <w:rPr>
+          <w:rFonts w:ascii="Arial" w:hAnsi="Arial" w:cs="Arial"/>
+          <w:sz w:val="22"/>
+          <w:szCs w:val="22"/>
+        </w:rPr>
+      </w:pPr>
+      <w:r>
+        <w:t>This project applies that idea at scale for the first time. Gaia DR4 measures full six-dimensional motion — parallaxes, proper motions, and radial velocities — for more stars, across more of the sky, than any survey before it, and at last holds inner-halo debris together in HJ instead of blurring it apart. The student will add chemistry to this map, gathering metallicities and abundances from every available source: Gaia's own XP and RVS spectra, DESI, APOGEE, GALAH, and LAMOST. Working from a tested Python/AGAMA framework, the student will map the joint distribution of Jacobi energy and metallicity, measure how sharply it clusters against permutation nulls across a range of bar pattern speeds, and rank the candidate relics of shredded galaxies and dissolved clusters. The search is exploratory: the data, not our expectations, decide what is there.</w:t>
       </w:r>
     </w:p>
     <w:p>
@@ -260,222 +131,46 @@
         </w:rPr>
       </w:pPr>
       <w:r>
-        <w:rPr>
-          <w:rFonts w:ascii="Arial" w:hAnsi="Arial" w:cs="Arial"/>
-          <w:sz w:val="22"/>
-          <w:szCs w:val="22"/>
-        </w:rPr>
-        <w:t>Hierarchical galaxy formation predicts that the Milky Way halo contains the overlapping remains of many accretion events. Nearby structures such as Gaia–Sausage–Enceladus are conspicuous in kinematics and chemistry, but older, lower-energy debris should have experienced more mixing and stronger interactions with the disc and bar. Recovering that material would reveal the early assembly of the inner halo and the destruction of some of the Galaxy's first satellites and star clusters.</w:t>
-      </w:r>
-    </w:p>
-    <w:p>
-      <w:pPr>
-        <w:spacing w:before="40" w:after="0" w:line="360" w:lineRule="auto"/>
-        <w:rPr>
-          <w:rFonts w:ascii="Arial" w:hAnsi="Arial" w:cs="Arial"/>
-          <w:sz w:val="22"/>
-          <w:szCs w:val="22"/>
-        </w:rPr>
-      </w:pPr>
-      <w:r>
-        <w:rPr>
-          <w:rFonts w:ascii="Arial" w:hAnsi="Arial" w:cs="Arial"/>
-          <w:sz w:val="22"/>
-          <w:szCs w:val="22"/>
-        </w:rPr>
-        <w:t xml:space="preserve">Most searches assume that orbital energy E and angular momentum </w:t>
-      </w:r>
-      <w:r>
-        <w:rPr>
-          <w:rFonts w:ascii="Arial" w:hAnsi="Arial" w:cs="Arial"/>
-          <w:sz w:val="22"/>
-          <w:szCs w:val="22"/>
-          <w:i/>
-          <w:iCs/>
-        </w:rPr>
-        <w:t>L</w:t>
-      </w:r>
-      <w:r>
-        <w:rPr>
-          <w:rFonts w:ascii="Arial" w:hAnsi="Arial" w:cs="Arial"/>
-          <w:sz w:val="22"/>
-          <w:szCs w:val="22"/>
-          <w:i/>
-          <w:iCs/>
-          <w:vertAlign w:val="subscript"/>
-        </w:rPr>
-        <w:t>z</w:t>
-      </w:r>
-      <w:r>
-        <w:rPr>
-          <w:rFonts w:ascii="Arial" w:hAnsi="Arial" w:cs="Arial"/>
-          <w:sz w:val="22"/>
-          <w:szCs w:val="22"/>
-        </w:rPr>
-        <w:t xml:space="preserve"> are approximately conserved. A rotating bar violates those assumptions: Dillamore &amp; Sanders (2025) find that it can spread low-energy, prograde, eccentric debris by factors of roughly 10–100 in E–</w:t>
-      </w:r>
-      <w:r>
-        <w:rPr>
-          <w:rFonts w:ascii="Arial" w:hAnsi="Arial" w:cs="Arial"/>
-          <w:sz w:val="22"/>
-          <w:szCs w:val="22"/>
-          <w:i/>
-          <w:iCs/>
-        </w:rPr>
-        <w:t>L</w:t>
-      </w:r>
-      <w:r>
-        <w:rPr>
-          <w:rFonts w:ascii="Arial" w:hAnsi="Arial" w:cs="Arial"/>
-          <w:sz w:val="22"/>
-          <w:szCs w:val="22"/>
-          <w:i/>
-          <w:iCs/>
-          <w:vertAlign w:val="subscript"/>
-        </w:rPr>
-        <w:t>z</w:t>
-      </w:r>
-      <w:r>
-        <w:rPr>
-          <w:rFonts w:ascii="Arial" w:hAnsi="Arial" w:cs="Arial"/>
-          <w:sz w:val="22"/>
-          <w:szCs w:val="22"/>
-        </w:rPr>
-        <w:t xml:space="preserve">. In a steadily rotating potential, the Jacobi integral </w:t>
-      </w:r>
-      <w:r>
-        <w:rPr>
-          <w:rFonts w:ascii="Arial" w:hAnsi="Arial" w:cs="Arial"/>
-          <w:sz w:val="22"/>
-          <w:szCs w:val="22"/>
-          <w:i/>
-          <w:iCs/>
-        </w:rPr>
-        <w:t>H</w:t>
-      </w:r>
-      <w:r>
-        <w:rPr>
-          <w:rFonts w:ascii="Arial" w:hAnsi="Arial" w:cs="Arial"/>
-          <w:sz w:val="22"/>
-          <w:szCs w:val="22"/>
-          <w:i/>
-          <w:iCs/>
-          <w:vertAlign w:val="subscript"/>
-        </w:rPr>
-        <w:t>J</w:t>
-      </w:r>
-      <w:r>
-        <w:rPr>
-          <w:rFonts w:ascii="Arial" w:hAnsi="Arial" w:cs="Arial"/>
-          <w:sz w:val="22"/>
-          <w:szCs w:val="22"/>
-        </w:rPr>
-        <w:t xml:space="preserve"> = E − </w:t>
-      </w:r>
-      <w:r>
-        <w:rPr>
-          <w:rFonts w:ascii="Arial" w:hAnsi="Arial" w:cs="Arial"/>
-          <w:sz w:val="22"/>
-          <w:szCs w:val="22"/>
-          <w:i/>
-          <w:iCs/>
-        </w:rPr>
-        <w:t>Ω</w:t>
-      </w:r>
-      <w:r>
-        <w:rPr>
-          <w:rFonts w:ascii="Arial" w:hAnsi="Arial" w:cs="Arial"/>
-          <w:sz w:val="22"/>
-          <w:szCs w:val="22"/>
-          <w:i/>
-          <w:iCs/>
-          <w:vertAlign w:val="subscript"/>
-        </w:rPr>
-        <w:t>b</w:t>
-      </w:r>
-      <w:r>
-        <w:rPr>
-          <w:rFonts w:ascii="Arial" w:hAnsi="Arial" w:cs="Arial"/>
-          <w:sz w:val="22"/>
-          <w:szCs w:val="22"/>
-        </w:rPr>
-        <w:t xml:space="preserve"> </w:t>
-      </w:r>
-      <w:r>
-        <w:rPr>
-          <w:rFonts w:ascii="Arial" w:hAnsi="Arial" w:cs="Arial"/>
-          <w:sz w:val="22"/>
-          <w:szCs w:val="22"/>
-          <w:i/>
-          <w:iCs/>
-        </w:rPr>
-        <w:t>L</w:t>
-      </w:r>
-      <w:r>
-        <w:rPr>
-          <w:rFonts w:ascii="Arial" w:hAnsi="Arial" w:cs="Arial"/>
-          <w:sz w:val="22"/>
-          <w:szCs w:val="22"/>
-          <w:i/>
-          <w:iCs/>
-          <w:vertAlign w:val="subscript"/>
-        </w:rPr>
-        <w:t>z</w:t>
-      </w:r>
-      <w:r>
-        <w:rPr>
-          <w:rFonts w:ascii="Arial" w:hAnsi="Arial" w:cs="Arial"/>
-          <w:sz w:val="22"/>
-          <w:szCs w:val="22"/>
-        </w:rPr>
-        <w:t xml:space="preserve"> is conserved. Debris may remain tighter in </w:t>
-      </w:r>
-      <w:r>
-        <w:rPr>
-          <w:rFonts w:ascii="Arial" w:hAnsi="Arial" w:cs="Arial"/>
-          <w:sz w:val="22"/>
-          <w:szCs w:val="22"/>
-          <w:i/>
-          <w:iCs/>
-        </w:rPr>
-        <w:t>H</w:t>
-      </w:r>
-      <w:r>
-        <w:rPr>
-          <w:rFonts w:ascii="Arial" w:hAnsi="Arial" w:cs="Arial"/>
-          <w:sz w:val="22"/>
-          <w:szCs w:val="22"/>
-          <w:i/>
-          <w:iCs/>
-          <w:vertAlign w:val="subscript"/>
-        </w:rPr>
-        <w:t>J</w:t>
-      </w:r>
-      <w:r>
-        <w:rPr>
-          <w:rFonts w:ascii="Arial" w:hAnsi="Arial" w:cs="Arial"/>
-          <w:sz w:val="22"/>
-          <w:szCs w:val="22"/>
-        </w:rPr>
-        <w:t>–[Fe/H] even when the bar evolves, although the result depends on the adopted potential and does not guarantee a pattern-speed measurement.</w:t>
-      </w:r>
-    </w:p>
-    <w:p>
-      <w:pPr>
-        <w:spacing w:before="40" w:after="0" w:line="360" w:lineRule="auto"/>
-        <w:rPr>
-          <w:rFonts w:ascii="Arial" w:hAnsi="Arial" w:cs="Arial"/>
-          <w:sz w:val="22"/>
-          <w:szCs w:val="22"/>
-        </w:rPr>
-      </w:pPr>
-      <w:r>
-        <w:rPr>
-          <w:rFonts w:ascii="Arial" w:hAnsi="Arial" w:cs="Arial"/>
-          <w:sz w:val="22"/>
-          <w:szCs w:val="22"/>
-        </w:rPr>
-        <w:t>The existing code implements a multi-component AGAMA potential, pattern-speed scans, Kozachenko–Leonenko nearest-neighbour entropy, and permutation nulls. In a 200,000-star mock containing 10,000 stars from 200 disrupted clusters, it recovers a broad injected signal. Exploratory APOGEE DR17 cuts also yield 11,245 metal-poor eccentric giants and a 134-star nitrogen-rich stress-test sample. These are feasibility tests, not Milky Way detections: even modest phase-space errors can move the preferred pattern speed or create a false maximum. Noise, covariance, and look-elsewhere calibration are therefore central to the project.</w:t>
+        <w:t>Galactic archaeology rests on a simple dynamical fact. In a Galaxy that is static and axisymmetric, a star's orbital energy E and angular momentum Lz — and, more generally, its actions — stay fixed. Debris from an accreted dwarf or star cluster therefore keeps its integrals of motion long after it has smeared into a featureless cloud in real space. Map the stars into that space and the shredded progenitors reappear as distinct clumps. Helmi and collaborators built the method on this idea, first recovering nearby debris streams through their angular momenta (Helmi et al. 1999) and then showing how a future astrometric survey could reconstruct the halo's building blocks in integral-of-motion space (Helmi &amp; de Zeeuw 2000). Chemistry preserves a parallel record of the same accretion history, and together the two define the programme of Galactic archaeology (Freeman &amp; Bland-Hawthorn 2002).</w:t>
+      </w:r>
+    </w:p>
+    <w:p>
+      <w:pPr>
+        <w:spacing w:before="40" w:after="0" w:line="360" w:lineRule="auto"/>
+        <w:rPr>
+          <w:rFonts w:ascii="Arial" w:hAnsi="Arial" w:cs="Arial"/>
+          <w:sz w:val="22"/>
+          <w:szCs w:val="22"/>
+        </w:rPr>
+      </w:pPr>
+      <w:r>
+        <w:t>Gaia turned that programme into a discovery machine. Its six-dimensional measurements exposed the debris of the Milky Way's last major merger — Gaia–Sausage–Enceladus — as an enormous, radially anisotropic clump dominating the inner halo in E–Lz (Belokurov et al. 2018; Helmi et al. 2018), and a growing catalogue of fainter retrograde and high-energy structures soon followed (e.g. Myeong et al. 2019). These successes share a bias, though. They pick out debris that still holds its integrals of motion — largely the younger, higher-energy accretions of the outer halo. The oldest and lowest-energy material, laid down when the Galaxy was young and stirred hardest ever since, is exactly the debris this map begins to lose.</w:t>
+      </w:r>
+    </w:p>
+    <w:p>
+      <w:pPr>
+        <w:spacing w:before="40" w:after="0" w:line="360" w:lineRule="auto"/>
+        <w:rPr>
+          <w:rFonts w:ascii="Arial" w:hAnsi="Arial" w:cs="Arial"/>
+          <w:sz w:val="22"/>
+          <w:szCs w:val="22"/>
+        </w:rPr>
+      </w:pPr>
+      <w:r>
+        <w:t>The inner Galaxy makes that loss concrete, and Dillamore &amp; Sanders (2025) explain why. Across an analytic toy model, test-particle simulations with bars both steady and slowing, and a cosmological zoom-in, they find one consistent result: the rotating bar inflates the E–Lz footprint of low-energy substructure ten- to a hundredfold, dissolving it into the smooth halo. The Jacobi integral endures where E and Lz do not. It holds exactly at a fixed pattern speed and stays far tighter than either quantity even as the bar decelerates, and, combined with chemistry, it keeps buried debris whole. The inner halo is not featureless, then, but structured in a coordinate no one has yet turned on a large observed sample. To do so demands full six-dimensional phase space for vast numbers of stars deep in the Galaxy.</w:t>
+      </w:r>
+    </w:p>
+    <w:p>
+      <w:pPr>
+        <w:spacing w:before="40" w:after="0" w:line="360" w:lineRule="auto"/>
+        <w:rPr>
+          <w:rFonts w:ascii="Arial" w:hAnsi="Arial" w:cs="Arial"/>
+          <w:sz w:val="22"/>
+          <w:szCs w:val="22"/>
+        </w:rPr>
+      </w:pPr>
+      <w:r>
+        <w:t>Gaia DR4 finally supplies it. Its 5.5 years of astrometry and much larger radial-velocity catalogue map precise, all-sky six-dimensional phase space for orders of magnitude more stars than the few tens of thousands of giants any single spectroscopic survey offers today. Here lies the heart of the project: too little phase-space information, not too few ideas, has held the HJ search back, and DR4 lifts that limit. Chemistry then enters as a second, independent witness — one the bar cannot rewrite. Through [Fe/H], and where available [α/Fe], [Al/Fe], and [N/Fe], disrupted dwarfs and shredded clusters each sign their names: the dwarfs in the downturn of the α-elements, the clusters in light-element anticorrelations and nitrogen excess (e.g. Belokurov &amp; Kravtsov 2023). A group that holds together in both HJ and chemistry makes a far stronger relic than one seen in dynamics alone. The machinery already works — a multi-component AGAMA potential, scans over pattern speed, nearest-neighbour entropy, and permutation nulls recover injected debris in mock catalogues — and the task now is to scale it to DR4 and turn it on the real inner halo.</w:t>
       </w:r>
     </w:p>
     <w:p>
@@ -502,698 +197,170 @@
         </w:rPr>
       </w:pPr>
       <w:r>
-        <w:rPr>
-          <w:rFonts w:ascii="Arial" w:hAnsi="Arial" w:cs="Arial"/>
-          <w:sz w:val="22"/>
-          <w:szCs w:val="22"/>
-        </w:rPr>
-        <w:t>The project will turn the exploratory notebooks into a reproducible experiment. It will first reproduce the stored benchmarks, then predefine the sample, null tests, and pattern-speed grid before evaluating new maxima. The core can be completed with Gaia DR3 and APOGEE DR17; other spectroscopic surveys and Gaia DR4 are extensions.</w:t>
-      </w:r>
-    </w:p>
-    <w:p>
-      <w:pPr>
-        <w:pStyle w:val="ListParagraph"/>
-        <w:keepLines/>
-        <w:numPr>
-          <w:ilvl w:val="0"/>
-          <w:numId w:val="1"/>
-        </w:numPr>
-        <w:spacing w:before="40" w:after="0" w:line="360" w:lineRule="auto"/>
-        <w:rPr>
-          <w:rFonts w:ascii="Arial" w:hAnsi="Arial" w:cs="Arial"/>
-          <w:sz w:val="22"/>
-          <w:szCs w:val="22"/>
-        </w:rPr>
-      </w:pPr>
-      <w:r>
-        <w:rPr>
-          <w:rFonts w:ascii="Arial" w:hAnsi="Arial" w:cs="Arial"/>
-          <w:sz w:val="22"/>
-          <w:szCs w:val="22"/>
+        <w:t>The project turns a tested framework into a discovery search. The student first reproduces the stored benchmarks and builds a pilot sample from data already in hand, then fixes the sample, the null tests, and the grid of pattern speeds before scaling everything to Gaia DR4. Gaia DR3 and today's spectroscopy carry the pilot; DR4 carries the discovery.</w:t>
+      </w:r>
+    </w:p>
+    <w:p>
+      <w:pPr>
+        <w:pStyle w:val="ListParagraph"/>
+        <w:keepLines/>
+        <w:numPr>
+          <w:ilvl w:val="0"/>
+          <w:numId w:val="1"/>
+        </w:numPr>
+        <w:spacing w:before="40" w:after="0" w:line="360" w:lineRule="auto"/>
+        <w:rPr>
+          <w:rFonts w:ascii="Arial" w:hAnsi="Arial" w:cs="Arial"/>
+          <w:sz w:val="22"/>
+          <w:szCs w:val="22"/>
+        </w:rPr>
+      </w:pPr>
+      <w:r>
+        <w:rPr>
           <w:b/>
-          <w:bCs/>
-        </w:rPr>
-        <w:t xml:space="preserve">Reproduce the starting benchmarks. </w:t>
-      </w:r>
-      <w:r>
-        <w:rPr>
-          <w:rFonts w:ascii="Arial" w:hAnsi="Arial" w:cs="Arial"/>
-          <w:sz w:val="22"/>
-          <w:szCs w:val="22"/>
-        </w:rPr>
-        <w:t>Run the existing disrupted-cluster mock and recover its broad contrast peak before changing the analysis. Repeat the 134-star nitrogen-rich calculation as a deliberately small-sample stress test, not as an astrophysical measurement. These locked examples will expose changes in units, coordinate conventions, random seeds, entropy implementation and pattern-speed grids.</w:t>
-      </w:r>
-    </w:p>
-    <w:p>
-      <w:pPr>
-        <w:pStyle w:val="ListParagraph"/>
-        <w:keepLines/>
-        <w:numPr>
-          <w:ilvl w:val="0"/>
-          <w:numId w:val="1"/>
-        </w:numPr>
-        <w:spacing w:before="40" w:after="0" w:line="360" w:lineRule="auto"/>
-        <w:rPr>
-          <w:rFonts w:ascii="Arial" w:hAnsi="Arial" w:cs="Arial"/>
-          <w:sz w:val="22"/>
-          <w:szCs w:val="22"/>
-        </w:rPr>
-      </w:pPr>
-      <w:r>
-        <w:rPr>
-          <w:rFonts w:ascii="Arial" w:hAnsi="Arial" w:cs="Arial"/>
-          <w:sz w:val="22"/>
-          <w:szCs w:val="22"/>
+        </w:rPr>
+        <w:t xml:space="preserve">Reproduce the tested framework. </w:t>
+      </w:r>
+      <w:r>
+        <w:t>Run the existing disrupted-cluster mock — 10,000 stars from 200 disrupted clusters within a 200,000-star background — and recover its broad contrast peak before changing anything. These locked examples expose changes in units, coordinate conventions, random seeds, entropy implementation, and pattern-speed grids.</w:t>
+      </w:r>
+    </w:p>
+    <w:p>
+      <w:pPr>
+        <w:pStyle w:val="ListParagraph"/>
+        <w:keepLines/>
+        <w:numPr>
+          <w:ilvl w:val="0"/>
+          <w:numId w:val="1"/>
+        </w:numPr>
+        <w:spacing w:before="40" w:after="0" w:line="360" w:lineRule="auto"/>
+        <w:rPr>
+          <w:rFonts w:ascii="Arial" w:hAnsi="Arial" w:cs="Arial"/>
+          <w:sz w:val="22"/>
+          <w:szCs w:val="22"/>
+        </w:rPr>
+      </w:pPr>
+      <w:r>
+        <w:rPr>
           <w:b/>
-          <w:bCs/>
-        </w:rPr>
-        <w:t xml:space="preserve">Rebuild the Gaia–APOGEE sample. </w:t>
-      </w:r>
-      <w:r>
-        <w:rPr>
-          <w:rFonts w:ascii="Arial" w:hAnsi="Arial" w:cs="Arial"/>
-          <w:sz w:val="22"/>
-          <w:szCs w:val="22"/>
-        </w:rPr>
-        <w:t>Reproduce the documented reduction from APOGEE DR17 to 11,245 giants using quality, gravity, distance-precision, metallicity and high-eccentricity cuts, while excluding known globular-cluster members. Retain Gaia astrometric covariances and survey metadata, and make thick-disc and well-known halo control samples. Each cut and its effect will be recorded rather than treating the cross-match as uniform.</w:t>
-      </w:r>
-    </w:p>
-    <w:p>
-      <w:pPr>
-        <w:pStyle w:val="ListParagraph"/>
-        <w:keepLines/>
-        <w:numPr>
-          <w:ilvl w:val="0"/>
-          <w:numId w:val="1"/>
-        </w:numPr>
-        <w:spacing w:before="40" w:after="0" w:line="360" w:lineRule="auto"/>
-        <w:rPr>
-          <w:rFonts w:ascii="Arial" w:hAnsi="Arial" w:cs="Arial"/>
-          <w:sz w:val="22"/>
-          <w:szCs w:val="22"/>
-        </w:rPr>
-      </w:pPr>
-      <w:r>
-        <w:rPr>
-          <w:rFonts w:ascii="Arial" w:hAnsi="Arial" w:cs="Arial"/>
-          <w:sz w:val="22"/>
-          <w:szCs w:val="22"/>
+        </w:rPr>
+        <w:t xml:space="preserve">Build and calibrate the pilot sample. </w:t>
+      </w:r>
+      <w:r>
+        <w:t>Assemble a Gaia DR3 phase-space sample cross-matched to current spectroscopy (APOGEE DR17 and similar), reproducing the documented selection of roughly 11,000 metal-poor, high-eccentricity giants while excluding known globular-cluster members. Retain Gaia astrometric covariances and survey metadata, and build thick-disc and known-halo control samples. Each cut and its effect is recorded rather than treating the cross-match as uniform.</w:t>
+      </w:r>
+    </w:p>
+    <w:p>
+      <w:pPr>
+        <w:pStyle w:val="ListParagraph"/>
+        <w:keepLines/>
+        <w:numPr>
+          <w:ilvl w:val="0"/>
+          <w:numId w:val="1"/>
+        </w:numPr>
+        <w:spacing w:before="40" w:after="0" w:line="360" w:lineRule="auto"/>
+        <w:rPr>
+          <w:rFonts w:ascii="Arial" w:hAnsi="Arial" w:cs="Arial"/>
+          <w:sz w:val="22"/>
+          <w:szCs w:val="22"/>
+        </w:rPr>
+      </w:pPr>
+      <w:r>
+        <w:rPr>
           <w:b/>
-          <w:bCs/>
         </w:rPr>
         <w:t xml:space="preserve">Compute the rotating-frame coordinates. </w:t>
       </w:r>
       <w:r>
-        <w:rPr>
-          <w:rFonts w:ascii="Arial" w:hAnsi="Arial" w:cs="Arial"/>
-          <w:sz w:val="22"/>
-          <w:szCs w:val="22"/>
-        </w:rPr>
-        <w:t xml:space="preserve">In a baseline disc–bulge–halo potential, calculate E and </w:t>
-      </w:r>
-      <w:r>
-        <w:rPr>
-          <w:rFonts w:ascii="Arial" w:hAnsi="Arial" w:cs="Arial"/>
-          <w:sz w:val="22"/>
-          <w:szCs w:val="22"/>
-          <w:i/>
-          <w:iCs/>
-        </w:rPr>
-        <w:t>L</w:t>
-      </w:r>
-      <w:r>
-        <w:rPr>
-          <w:rFonts w:ascii="Arial" w:hAnsi="Arial" w:cs="Arial"/>
-          <w:sz w:val="22"/>
-          <w:szCs w:val="22"/>
-          <w:i/>
-          <w:iCs/>
-          <w:vertAlign w:val="subscript"/>
-        </w:rPr>
-        <w:t>z</w:t>
-      </w:r>
-      <w:r>
-        <w:rPr>
-          <w:rFonts w:ascii="Arial" w:hAnsi="Arial" w:cs="Arial"/>
-          <w:sz w:val="22"/>
-          <w:szCs w:val="22"/>
-        </w:rPr>
-        <w:t xml:space="preserve">, then </w:t>
-      </w:r>
-      <w:r>
-        <w:rPr>
-          <w:rFonts w:ascii="Arial" w:hAnsi="Arial" w:cs="Arial"/>
-          <w:sz w:val="22"/>
-          <w:szCs w:val="22"/>
-          <w:i/>
-          <w:iCs/>
-        </w:rPr>
-        <w:t>H</w:t>
-      </w:r>
-      <w:r>
-        <w:rPr>
-          <w:rFonts w:ascii="Arial" w:hAnsi="Arial" w:cs="Arial"/>
-          <w:sz w:val="22"/>
-          <w:szCs w:val="22"/>
-          <w:i/>
-          <w:iCs/>
-          <w:vertAlign w:val="subscript"/>
-        </w:rPr>
-        <w:t>J</w:t>
-      </w:r>
-      <w:r>
-        <w:rPr>
-          <w:rFonts w:ascii="Arial" w:hAnsi="Arial" w:cs="Arial"/>
-          <w:sz w:val="22"/>
-          <w:szCs w:val="22"/>
-        </w:rPr>
-        <w:t xml:space="preserve"> = E − </w:t>
-      </w:r>
-      <w:r>
-        <w:rPr>
-          <w:rFonts w:ascii="Arial" w:hAnsi="Arial" w:cs="Arial"/>
-          <w:sz w:val="22"/>
-          <w:szCs w:val="22"/>
-          <w:i/>
-          <w:iCs/>
-        </w:rPr>
-        <w:t>Ω</w:t>
-      </w:r>
-      <w:r>
-        <w:rPr>
-          <w:rFonts w:ascii="Arial" w:hAnsi="Arial" w:cs="Arial"/>
-          <w:sz w:val="22"/>
-          <w:szCs w:val="22"/>
-          <w:i/>
-          <w:iCs/>
-          <w:vertAlign w:val="subscript"/>
-        </w:rPr>
-        <w:t>b</w:t>
-      </w:r>
-      <w:r>
-        <w:rPr>
-          <w:rFonts w:ascii="Arial" w:hAnsi="Arial" w:cs="Arial"/>
-          <w:sz w:val="22"/>
-          <w:szCs w:val="22"/>
-        </w:rPr>
-        <w:t xml:space="preserve"> </w:t>
-      </w:r>
-      <w:r>
-        <w:rPr>
-          <w:rFonts w:ascii="Arial" w:hAnsi="Arial" w:cs="Arial"/>
-          <w:sz w:val="22"/>
-          <w:szCs w:val="22"/>
-          <w:i/>
-          <w:iCs/>
-        </w:rPr>
-        <w:t>L</w:t>
-      </w:r>
-      <w:r>
-        <w:rPr>
-          <w:rFonts w:ascii="Arial" w:hAnsi="Arial" w:cs="Arial"/>
-          <w:sz w:val="22"/>
-          <w:szCs w:val="22"/>
-          <w:i/>
-          <w:iCs/>
-          <w:vertAlign w:val="subscript"/>
-        </w:rPr>
-        <w:t>z</w:t>
-      </w:r>
-      <w:r>
-        <w:rPr>
-          <w:rFonts w:ascii="Arial" w:hAnsi="Arial" w:cs="Arial"/>
-          <w:sz w:val="22"/>
-          <w:szCs w:val="22"/>
-        </w:rPr>
-        <w:t xml:space="preserve"> over a pre-declared grid of bar pattern speeds and a small set of plausible potential variants. Compare conventional E–</w:t>
-      </w:r>
-      <w:r>
-        <w:rPr>
-          <w:rFonts w:ascii="Arial" w:hAnsi="Arial" w:cs="Arial"/>
-          <w:sz w:val="22"/>
-          <w:szCs w:val="22"/>
-          <w:i/>
-          <w:iCs/>
-        </w:rPr>
-        <w:t>L</w:t>
-      </w:r>
-      <w:r>
-        <w:rPr>
-          <w:rFonts w:ascii="Arial" w:hAnsi="Arial" w:cs="Arial"/>
-          <w:sz w:val="22"/>
-          <w:szCs w:val="22"/>
-          <w:i/>
-          <w:iCs/>
-          <w:vertAlign w:val="subscript"/>
-        </w:rPr>
-        <w:t>z</w:t>
-      </w:r>
-      <w:r>
-        <w:rPr>
-          <w:rFonts w:ascii="Arial" w:hAnsi="Arial" w:cs="Arial"/>
-          <w:sz w:val="22"/>
-          <w:szCs w:val="22"/>
-        </w:rPr>
-        <w:t xml:space="preserve"> views with </w:t>
-      </w:r>
-      <w:r>
-        <w:rPr>
-          <w:rFonts w:ascii="Arial" w:hAnsi="Arial" w:cs="Arial"/>
-          <w:sz w:val="22"/>
-          <w:szCs w:val="22"/>
-          <w:i/>
-          <w:iCs/>
-        </w:rPr>
-        <w:t>H</w:t>
-      </w:r>
-      <w:r>
-        <w:rPr>
-          <w:rFonts w:ascii="Arial" w:hAnsi="Arial" w:cs="Arial"/>
-          <w:sz w:val="22"/>
-          <w:szCs w:val="22"/>
-          <w:i/>
-          <w:iCs/>
-          <w:vertAlign w:val="subscript"/>
-        </w:rPr>
-        <w:t>J</w:t>
-      </w:r>
-      <w:r>
-        <w:rPr>
-          <w:rFonts w:ascii="Arial" w:hAnsi="Arial" w:cs="Arial"/>
-          <w:sz w:val="22"/>
-          <w:szCs w:val="22"/>
-        </w:rPr>
-        <w:t>–[Fe/H]. All subsequent tests will compare the pre-declared pattern-speed grid and potential variants rather than selecting the most attractive diagram by eye.</w:t>
-      </w:r>
-    </w:p>
-    <w:p>
-      <w:pPr>
-        <w:pStyle w:val="ListParagraph"/>
-        <w:keepLines/>
-        <w:numPr>
-          <w:ilvl w:val="0"/>
-          <w:numId w:val="1"/>
-        </w:numPr>
-        <w:spacing w:before="40" w:after="0" w:line="360" w:lineRule="auto"/>
-        <w:rPr>
-          <w:rFonts w:ascii="Arial" w:hAnsi="Arial" w:cs="Arial"/>
-          <w:sz w:val="22"/>
-          <w:szCs w:val="22"/>
-        </w:rPr>
-      </w:pPr>
-      <w:r>
-        <w:rPr>
-          <w:rFonts w:ascii="Arial" w:hAnsi="Arial" w:cs="Arial"/>
-          <w:sz w:val="22"/>
-          <w:szCs w:val="22"/>
+        <w:t>In a baseline disc–bulge–halo AGAMA potential, calculate E and Lz, then HJ = E − Ωb Lz over a pre-declared grid of bar pattern speeds and a small set of plausible potential variants. Compare conventional E–Lz views with HJ–[Fe/H] directly, rather than selecting the most attractive diagram by eye.</w:t>
+      </w:r>
+    </w:p>
+    <w:p>
+      <w:pPr>
+        <w:pStyle w:val="ListParagraph"/>
+        <w:keepLines/>
+        <w:numPr>
+          <w:ilvl w:val="0"/>
+          <w:numId w:val="1"/>
+        </w:numPr>
+        <w:spacing w:before="40" w:after="0" w:line="360" w:lineRule="auto"/>
+        <w:rPr>
+          <w:rFonts w:ascii="Arial" w:hAnsi="Arial" w:cs="Arial"/>
+          <w:sz w:val="22"/>
+          <w:szCs w:val="22"/>
+        </w:rPr>
+      </w:pPr>
+      <w:r>
+        <w:rPr>
           <w:b/>
-          <w:bCs/>
         </w:rPr>
         <w:t xml:space="preserve">Measure contrast against permutation nulls. </w:t>
       </w:r>
       <w:r>
-        <w:rPr>
-          <w:rFonts w:ascii="Arial" w:hAnsi="Arial" w:cs="Arial"/>
-          <w:sz w:val="22"/>
-          <w:szCs w:val="22"/>
-        </w:rPr>
-        <w:t xml:space="preserve">Estimate the nearest-neighbour entropy </w:t>
-      </w:r>
-      <w:r>
-        <w:rPr>
-          <w:rFonts w:ascii="Arial" w:hAnsi="Arial" w:cs="Arial"/>
-          <w:sz w:val="22"/>
-          <w:szCs w:val="22"/>
-          <w:i/>
-          <w:iCs/>
-        </w:rPr>
-        <w:t>H</w:t>
-      </w:r>
-      <w:r>
-        <w:rPr>
-          <w:rFonts w:ascii="Arial" w:hAnsi="Arial" w:cs="Arial"/>
-          <w:sz w:val="22"/>
-          <w:szCs w:val="22"/>
-          <w:i/>
-          <w:iCs/>
-          <w:vertAlign w:val="subscript"/>
-        </w:rPr>
-        <w:t>real</w:t>
-      </w:r>
-      <w:r>
-        <w:rPr>
-          <w:rFonts w:ascii="Arial" w:hAnsi="Arial" w:cs="Arial"/>
-          <w:sz w:val="22"/>
-          <w:szCs w:val="22"/>
-        </w:rPr>
-        <w:t xml:space="preserve"> of the standardised </w:t>
-      </w:r>
-      <w:r>
-        <w:rPr>
-          <w:rFonts w:ascii="Arial" w:hAnsi="Arial" w:cs="Arial"/>
-          <w:sz w:val="22"/>
-          <w:szCs w:val="22"/>
-          <w:i/>
-          <w:iCs/>
-        </w:rPr>
-        <w:t>H</w:t>
-      </w:r>
-      <w:r>
-        <w:rPr>
-          <w:rFonts w:ascii="Arial" w:hAnsi="Arial" w:cs="Arial"/>
-          <w:sz w:val="22"/>
-          <w:szCs w:val="22"/>
-          <w:i/>
-          <w:iCs/>
-          <w:vertAlign w:val="subscript"/>
-        </w:rPr>
-        <w:t>J</w:t>
-      </w:r>
-      <w:r>
-        <w:rPr>
-          <w:rFonts w:ascii="Arial" w:hAnsi="Arial" w:cs="Arial"/>
-          <w:sz w:val="22"/>
-          <w:szCs w:val="22"/>
-        </w:rPr>
-        <w:t xml:space="preserve">–[Fe/H] distribution and compare it with </w:t>
-      </w:r>
-      <w:r>
-        <w:rPr>
-          <w:rFonts w:ascii="Arial" w:hAnsi="Arial" w:cs="Arial"/>
-          <w:sz w:val="22"/>
-          <w:szCs w:val="22"/>
-          <w:i/>
-          <w:iCs/>
-        </w:rPr>
-        <w:t>H</w:t>
-      </w:r>
-      <w:r>
-        <w:rPr>
-          <w:rFonts w:ascii="Arial" w:hAnsi="Arial" w:cs="Arial"/>
-          <w:sz w:val="22"/>
-          <w:szCs w:val="22"/>
-          <w:i/>
-          <w:iCs/>
-          <w:vertAlign w:val="subscript"/>
-        </w:rPr>
-        <w:t>null</w:t>
-      </w:r>
-      <w:r>
-        <w:rPr>
-          <w:rFonts w:ascii="Arial" w:hAnsi="Arial" w:cs="Arial"/>
-          <w:sz w:val="22"/>
-          <w:szCs w:val="22"/>
-        </w:rPr>
-        <w:t xml:space="preserve"> after permuting </w:t>
-      </w:r>
-      <w:r>
-        <w:rPr>
-          <w:rFonts w:ascii="Arial" w:hAnsi="Arial" w:cs="Arial"/>
-          <w:sz w:val="22"/>
-          <w:szCs w:val="22"/>
-          <w:i/>
-          <w:iCs/>
-        </w:rPr>
-        <w:t>H</w:t>
-      </w:r>
-      <w:r>
-        <w:rPr>
-          <w:rFonts w:ascii="Arial" w:hAnsi="Arial" w:cs="Arial"/>
-          <w:sz w:val="22"/>
-          <w:szCs w:val="22"/>
-          <w:i/>
-          <w:iCs/>
-          <w:vertAlign w:val="subscript"/>
-        </w:rPr>
-        <w:t>J</w:t>
-      </w:r>
-      <w:r>
-        <w:rPr>
-          <w:rFonts w:ascii="Arial" w:hAnsi="Arial" w:cs="Arial"/>
-          <w:sz w:val="22"/>
-          <w:szCs w:val="22"/>
-        </w:rPr>
-        <w:t xml:space="preserve"> relative to metallicity. The statistic ΔH = </w:t>
-      </w:r>
-      <w:r>
-        <w:rPr>
-          <w:rFonts w:ascii="Arial" w:hAnsi="Arial" w:cs="Arial"/>
-          <w:sz w:val="22"/>
-          <w:szCs w:val="22"/>
-          <w:i/>
-          <w:iCs/>
-        </w:rPr>
-        <w:t>H</w:t>
-      </w:r>
-      <w:r>
-        <w:rPr>
-          <w:rFonts w:ascii="Arial" w:hAnsi="Arial" w:cs="Arial"/>
-          <w:sz w:val="22"/>
-          <w:szCs w:val="22"/>
-          <w:i/>
-          <w:iCs/>
-          <w:vertAlign w:val="subscript"/>
-        </w:rPr>
-        <w:t>null</w:t>
-      </w:r>
-      <w:r>
-        <w:rPr>
-          <w:rFonts w:ascii="Arial" w:hAnsi="Arial" w:cs="Arial"/>
-          <w:sz w:val="22"/>
-          <w:szCs w:val="22"/>
-        </w:rPr>
-        <w:t xml:space="preserve"> − </w:t>
-      </w:r>
-      <w:r>
-        <w:rPr>
-          <w:rFonts w:ascii="Arial" w:hAnsi="Arial" w:cs="Arial"/>
-          <w:sz w:val="22"/>
-          <w:szCs w:val="22"/>
-          <w:i/>
-          <w:iCs/>
-        </w:rPr>
-        <w:t>H</w:t>
-      </w:r>
-      <w:r>
-        <w:rPr>
-          <w:rFonts w:ascii="Arial" w:hAnsi="Arial" w:cs="Arial"/>
-          <w:sz w:val="22"/>
-          <w:szCs w:val="22"/>
-          <w:i/>
-          <w:iCs/>
-          <w:vertAlign w:val="subscript"/>
-        </w:rPr>
-        <w:t>real</w:t>
-      </w:r>
-      <w:r>
-        <w:rPr>
-          <w:rFonts w:ascii="Arial" w:hAnsi="Arial" w:cs="Arial"/>
-          <w:sz w:val="22"/>
-          <w:szCs w:val="22"/>
-        </w:rPr>
-        <w:t xml:space="preserve"> is positive when the real data contain extra chemo-dynamical structure. Calibrate its distribution across neighbour choices, energy bins, and </w:t>
-      </w:r>
-      <w:r>
-        <w:rPr>
-          <w:rFonts w:ascii="Arial" w:hAnsi="Arial" w:cs="Arial"/>
-          <w:sz w:val="22"/>
-          <w:szCs w:val="22"/>
-          <w:i/>
-          <w:iCs/>
-        </w:rPr>
-        <w:t>Ω</w:t>
-      </w:r>
-      <w:r>
-        <w:rPr>
-          <w:rFonts w:ascii="Arial" w:hAnsi="Arial" w:cs="Arial"/>
-          <w:sz w:val="22"/>
-          <w:szCs w:val="22"/>
-          <w:i/>
-          <w:iCs/>
-          <w:vertAlign w:val="subscript"/>
-        </w:rPr>
-        <w:t>b</w:t>
-      </w:r>
-      <w:r>
-        <w:rPr>
-          <w:rFonts w:ascii="Arial" w:hAnsi="Arial" w:cs="Arial"/>
-          <w:sz w:val="22"/>
-          <w:szCs w:val="22"/>
-        </w:rPr>
-        <w:t xml:space="preserve"> with repeated permutations and smooth mocks, including the full trials factor.</w:t>
-      </w:r>
-    </w:p>
-    <w:p>
-      <w:pPr>
-        <w:pStyle w:val="ListParagraph"/>
-        <w:keepLines/>
-        <w:numPr>
-          <w:ilvl w:val="0"/>
-          <w:numId w:val="1"/>
-        </w:numPr>
-        <w:spacing w:before="40" w:after="0" w:line="360" w:lineRule="auto"/>
-        <w:rPr>
-          <w:rFonts w:ascii="Arial" w:hAnsi="Arial" w:cs="Arial"/>
-          <w:sz w:val="22"/>
-          <w:szCs w:val="22"/>
-        </w:rPr>
-      </w:pPr>
-      <w:r>
-        <w:rPr>
-          <w:rFonts w:ascii="Arial" w:hAnsi="Arial" w:cs="Arial"/>
-          <w:sz w:val="22"/>
-          <w:szCs w:val="22"/>
+        <w:t>Estimate the nearest-neighbour entropy of the standardised HJ–[Fe/H] distribution and compare it with the entropy after permuting HJ relative to metallicity; the contrast is positive when the data contain extra chemo-dynamical structure. Calibrate its distribution across neighbour choices, energy bins, and Ωb with repeated permutations and smooth mocks, including the full trials factor. Benchmark the gain against standard E–Lz clustering to show what HJ adds.</w:t>
+      </w:r>
+    </w:p>
+    <w:p>
+      <w:pPr>
+        <w:pStyle w:val="ListParagraph"/>
+        <w:keepLines/>
+        <w:numPr>
+          <w:ilvl w:val="0"/>
+          <w:numId w:val="1"/>
+        </w:numPr>
+        <w:spacing w:before="40" w:after="0" w:line="360" w:lineRule="auto"/>
+        <w:rPr>
+          <w:rFonts w:ascii="Arial" w:hAnsi="Arial" w:cs="Arial"/>
+          <w:sz w:val="22"/>
+          <w:szCs w:val="22"/>
+        </w:rPr>
+      </w:pPr>
+      <w:r>
+        <w:rPr>
           <w:b/>
-          <w:bCs/>
-        </w:rPr>
-        <w:t xml:space="preserve">Propagate errors and test recovery. </w:t>
-      </w:r>
-      <w:r>
-        <w:rPr>
-          <w:rFonts w:ascii="Arial" w:hAnsi="Arial" w:cs="Arial"/>
-          <w:sz w:val="22"/>
-          <w:szCs w:val="22"/>
-        </w:rPr>
-        <w:t>Propagate the correlated Gaia measurements, distances, radial velocities, and metallicities through the complete calculation by Monte Carlo sampling. Existing tests show that approximately 5 per cent errors can shift a peak and 10 per cent errors can produce a spurious high-</w:t>
-      </w:r>
-      <w:r>
-        <w:rPr>
-          <w:rFonts w:ascii="Arial" w:hAnsi="Arial" w:cs="Arial"/>
-          <w:sz w:val="22"/>
-          <w:szCs w:val="22"/>
-          <w:i/>
-          <w:iCs/>
-        </w:rPr>
-        <w:t>Ω</w:t>
-      </w:r>
-      <w:r>
-        <w:rPr>
-          <w:rFonts w:ascii="Arial" w:hAnsi="Arial" w:cs="Arial"/>
-          <w:sz w:val="22"/>
-          <w:szCs w:val="22"/>
-          <w:i/>
-          <w:iCs/>
-          <w:vertAlign w:val="subscript"/>
-        </w:rPr>
-        <w:t>b</w:t>
-      </w:r>
-      <w:r>
-        <w:rPr>
-          <w:rFonts w:ascii="Arial" w:hAnsi="Arial" w:cs="Arial"/>
-          <w:sz w:val="22"/>
-          <w:szCs w:val="22"/>
-        </w:rPr>
-        <w:t xml:space="preserve"> maximum. Realistic injections will therefore measure bias, recovery, and false positives as functions of debris fraction, age, and error.</w:t>
-      </w:r>
-    </w:p>
-    <w:p>
-      <w:pPr>
-        <w:pStyle w:val="ListParagraph"/>
-        <w:keepLines/>
-        <w:numPr>
-          <w:ilvl w:val="0"/>
-          <w:numId w:val="1"/>
-        </w:numPr>
-        <w:spacing w:before="40" w:after="0" w:line="360" w:lineRule="auto"/>
-        <w:rPr>
-          <w:rFonts w:ascii="Arial" w:hAnsi="Arial" w:cs="Arial"/>
-          <w:sz w:val="22"/>
-          <w:szCs w:val="22"/>
-        </w:rPr>
-      </w:pPr>
-      <w:r>
-        <w:rPr>
-          <w:rFonts w:ascii="Arial" w:hAnsi="Arial" w:cs="Arial"/>
-          <w:sz w:val="22"/>
-          <w:szCs w:val="22"/>
+        </w:rPr>
+        <w:t xml:space="preserve">Scale to Gaia DR4 and the full chemical catalogue. </w:t>
+      </w:r>
+      <w:r>
+        <w:t>Ingest DR4 six-dimensional phase space and cross-match a union metallicity and abundance catalogue (Gaia XP and RVS, DESI, APOGEE, GALAH, LAMOST). Propagate the correlated astrometry, distances, radial velocities, and metallicities by Monte Carlo through the whole calculation, and repeat the search at DR4 volume and sky coverage. Existing tests show that about 5 per cent errors can shift a peak and about 10 per cent errors can create a spurious high-Ωb maximum, so realistic injections measure bias, recovery, and false positives as functions of debris fraction, age, and error.</w:t>
+      </w:r>
+    </w:p>
+    <w:p>
+      <w:pPr>
+        <w:pStyle w:val="ListParagraph"/>
+        <w:keepLines/>
+        <w:numPr>
+          <w:ilvl w:val="0"/>
+          <w:numId w:val="1"/>
+        </w:numPr>
+        <w:spacing w:before="40" w:after="0" w:line="360" w:lineRule="auto"/>
+        <w:rPr>
+          <w:rFonts w:ascii="Arial" w:hAnsi="Arial" w:cs="Arial"/>
+          <w:sz w:val="22"/>
+          <w:szCs w:val="22"/>
+        </w:rPr>
+      </w:pPr>
+      <w:r>
+        <w:rPr>
           <w:b/>
-          <w:bCs/>
-        </w:rPr>
-        <w:t xml:space="preserve">Localise and interpret candidate clumps. </w:t>
-      </w:r>
-      <w:r>
-        <w:rPr>
-          <w:rFonts w:ascii="Arial" w:hAnsi="Arial" w:cs="Arial"/>
-          <w:sz w:val="22"/>
-          <w:szCs w:val="22"/>
-        </w:rPr>
-        <w:t xml:space="preserve">The global entropy statistic detects structure but does not assign membership. After the global test, use a local-density or mixture model to identify which stars generate a robust excess, then examine their sky distribution, velocities, orbits, and multi-element chemistry. Compare accreted-debris and disrupted-cluster interpretations against bar resonances, disc contamination, and selection boundaries. Inferring </w:t>
-      </w:r>
-      <w:r>
-        <w:rPr>
-          <w:rFonts w:ascii="Arial" w:hAnsi="Arial" w:cs="Arial"/>
-          <w:sz w:val="22"/>
-          <w:szCs w:val="22"/>
-          <w:i/>
-          <w:iCs/>
-        </w:rPr>
-        <w:t>Ω</w:t>
-      </w:r>
-      <w:r>
-        <w:rPr>
-          <w:rFonts w:ascii="Arial" w:hAnsi="Arial" w:cs="Arial"/>
-          <w:sz w:val="22"/>
-          <w:szCs w:val="22"/>
-          <w:i/>
-          <w:iCs/>
-          <w:vertAlign w:val="subscript"/>
-        </w:rPr>
-        <w:t>b</w:t>
-      </w:r>
-      <w:r>
-        <w:rPr>
-          <w:rFonts w:ascii="Arial" w:hAnsi="Arial" w:cs="Arial"/>
-          <w:sz w:val="22"/>
-          <w:szCs w:val="22"/>
-        </w:rPr>
-        <w:t xml:space="preserve"> is a stretch goal only after these alternatives survive.</w:t>
-      </w:r>
-    </w:p>
-    <w:p>
-      <w:pPr>
-        <w:spacing w:before="40" w:after="0" w:line="360" w:lineRule="auto"/>
-        <w:rPr>
-          <w:rFonts w:ascii="Arial" w:hAnsi="Arial" w:cs="Arial"/>
-          <w:sz w:val="22"/>
-          <w:szCs w:val="22"/>
-        </w:rPr>
-      </w:pPr>
-      <w:r>
-        <w:rPr>
-          <w:rFonts w:ascii="Arial" w:hAnsi="Arial" w:cs="Arial"/>
-          <w:sz w:val="22"/>
-          <w:szCs w:val="22"/>
-        </w:rPr>
-        <w:t>The principal deliverables are a documented and tested analysis pipeline, a reproducible 11,245-star chemo-dynamical sample, calibrated contrast curves, and a locally vetted candidate list or upper limits. A null result remains informative: the recovery tests will quantify when Jacobi energy preserves information that E–</w:t>
-      </w:r>
-      <w:r>
-        <w:rPr>
-          <w:rFonts w:ascii="Arial" w:hAnsi="Arial" w:cs="Arial"/>
-          <w:sz w:val="22"/>
-          <w:szCs w:val="22"/>
-          <w:i/>
-          <w:iCs/>
-        </w:rPr>
-        <w:t>L</w:t>
-      </w:r>
-      <w:r>
-        <w:rPr>
-          <w:rFonts w:ascii="Arial" w:hAnsi="Arial" w:cs="Arial"/>
-          <w:sz w:val="22"/>
-          <w:szCs w:val="22"/>
-          <w:i/>
-          <w:iCs/>
-          <w:vertAlign w:val="subscript"/>
-        </w:rPr>
-        <w:t>z</w:t>
-      </w:r>
-      <w:r>
-        <w:rPr>
-          <w:rFonts w:ascii="Arial" w:hAnsi="Arial" w:cs="Arial"/>
-          <w:sz w:val="22"/>
-          <w:szCs w:val="22"/>
-        </w:rPr>
-        <w:t xml:space="preserve"> loses. Any constraint on the bar pattern speed will be reported only if it is stable to noise, potential choice, and sample definition.</w:t>
+        </w:rPr>
+        <w:t xml:space="preserve">Localise, chemically confirm, and interpret candidate clumps. </w:t>
+      </w:r>
+      <w:r>
+        <w:t>The global statistic detects structure but does not assign membership. Use a local-density or mixture model to identify which stars generate a robust excess, then test whether they are also chemically coherent — an α-knee for dwarf debris, or light-element anticorrelations and nitrogen enhancement for disrupted clusters. Examine their sky distribution, velocities, orbits, and multi-element chemistry, and weigh accreted-debris and disrupted-cluster interpretations against bar resonances, disc contamination, and selection boundaries. Inferring Ωb is a stretch goal, attempted only after these alternatives survive.</w:t>
+      </w:r>
+    </w:p>
+    <w:p>
+      <w:pPr>
+        <w:spacing w:before="40" w:after="0" w:line="360" w:lineRule="auto"/>
+        <w:rPr>
+          <w:rFonts w:ascii="Arial" w:hAnsi="Arial" w:cs="Arial"/>
+          <w:sz w:val="22"/>
+          <w:szCs w:val="22"/>
+        </w:rPr>
+      </w:pPr>
+      <w:r>
+        <w:t>The project delivers four things: a documented, tested analysis pipeline; a reproducible chemo-dynamical sample spanning the DR3 pilot and the DR4 search; calibrated contrast curves; and a chemically vetted list of candidate inner-halo relics, or firm upper limits. Even a null result informs: the recovery tests show exactly when Jacobi energy keeps what E–Lz loses. The student will claim a bar pattern speed only if it survives changes in the noise, the assumed potential, and the sample definition.</w:t>
       </w:r>
     </w:p>
     <w:p>
@@ -1544,6 +711,120 @@
         </w:rPr>
       </w:pPr>
       <w:r>
+        <w:t>Helmi, A., White, S. D. M., de Zeeuw, P. T. &amp; Zhao, H. (1999), ‘Debris streams in the solar neighbourhood as relicts from the formation of the Milky Way’, Nature, 402, 53. https://doi.org/10.1038/46980</w:t>
+      </w:r>
+    </w:p>
+    <w:p>
+      <w:pPr>
+        <w:pStyle w:val="ListParagraph"/>
+        <w:keepLines/>
+        <w:numPr>
+          <w:ilvl w:val="0"/>
+          <w:numId w:val="1"/>
+        </w:numPr>
+        <w:spacing w:before="40" w:after="0" w:line="360" w:lineRule="auto"/>
+        <w:rPr>
+          <w:rFonts w:ascii="Arial" w:hAnsi="Arial" w:cs="Arial"/>
+          <w:sz w:val="22"/>
+          <w:szCs w:val="22"/>
+        </w:rPr>
+      </w:pPr>
+      <w:r>
+        <w:t>Helmi, A. &amp; de Zeeuw, P. T. (2000), ‘Mapping the substructure in the Galactic halo with the next generation of astrometric satellites’, MNRAS, 319, 657. https://doi.org/10.1046/j.1365-8711.2000.03895.x</w:t>
+      </w:r>
+    </w:p>
+    <w:p>
+      <w:pPr>
+        <w:pStyle w:val="ListParagraph"/>
+        <w:keepLines/>
+        <w:numPr>
+          <w:ilvl w:val="0"/>
+          <w:numId w:val="1"/>
+        </w:numPr>
+        <w:spacing w:before="40" w:after="0" w:line="360" w:lineRule="auto"/>
+        <w:rPr>
+          <w:rFonts w:ascii="Arial" w:hAnsi="Arial" w:cs="Arial"/>
+          <w:sz w:val="22"/>
+          <w:szCs w:val="22"/>
+        </w:rPr>
+      </w:pPr>
+      <w:r>
+        <w:t>Freeman, K. &amp; Bland-Hawthorn, J. (2002), ‘The New Galaxy: Signatures of Its Formation’, ARA&amp;A, 40, 487. https://doi.org/10.1146/annurev.astro.40.060401.093840</w:t>
+      </w:r>
+    </w:p>
+    <w:p>
+      <w:pPr>
+        <w:pStyle w:val="ListParagraph"/>
+        <w:keepLines/>
+        <w:numPr>
+          <w:ilvl w:val="0"/>
+          <w:numId w:val="1"/>
+        </w:numPr>
+        <w:spacing w:before="40" w:after="0" w:line="360" w:lineRule="auto"/>
+        <w:rPr>
+          <w:rFonts w:ascii="Arial" w:hAnsi="Arial" w:cs="Arial"/>
+          <w:sz w:val="22"/>
+          <w:szCs w:val="22"/>
+        </w:rPr>
+      </w:pPr>
+      <w:r>
+        <w:t>Belokurov, V., Erkal, D., Evans, N. W., Koposov, S. E. &amp; Deason, A. J. (2018), ‘Co-formation of the disc and the stellar halo’, MNRAS, 478, 611. https://doi.org/10.1093/mnras/sty982</w:t>
+      </w:r>
+    </w:p>
+    <w:p>
+      <w:pPr>
+        <w:pStyle w:val="ListParagraph"/>
+        <w:keepLines/>
+        <w:numPr>
+          <w:ilvl w:val="0"/>
+          <w:numId w:val="1"/>
+        </w:numPr>
+        <w:spacing w:before="40" w:after="0" w:line="360" w:lineRule="auto"/>
+        <w:rPr>
+          <w:rFonts w:ascii="Arial" w:hAnsi="Arial" w:cs="Arial"/>
+          <w:sz w:val="22"/>
+          <w:szCs w:val="22"/>
+        </w:rPr>
+      </w:pPr>
+      <w:r>
+        <w:t>Helmi, A. et al. (2018), ‘The merger that led to the formation of the Milky Way’s inner stellar halo and thick disk’, Nature, 563, 85. https://doi.org/10.1038/s41586-018-0625-x</w:t>
+      </w:r>
+    </w:p>
+    <w:p>
+      <w:pPr>
+        <w:pStyle w:val="ListParagraph"/>
+        <w:keepLines/>
+        <w:numPr>
+          <w:ilvl w:val="0"/>
+          <w:numId w:val="1"/>
+        </w:numPr>
+        <w:spacing w:before="40" w:after="0" w:line="360" w:lineRule="auto"/>
+        <w:rPr>
+          <w:rFonts w:ascii="Arial" w:hAnsi="Arial" w:cs="Arial"/>
+          <w:sz w:val="22"/>
+          <w:szCs w:val="22"/>
+        </w:rPr>
+      </w:pPr>
+      <w:r>
+        <w:t>Myeong, G. C., Vasiliev, E., Iorio, G., Evans, N. W. &amp; Belokurov, V. (2019), ‘Evidence for two early accretion events that built the Milky Way stellar halo’, MNRAS, 488, 1235. https://doi.org/10.1093/mnras/stz1770</w:t>
+      </w:r>
+    </w:p>
+    <w:p>
+      <w:pPr>
+        <w:pStyle w:val="ListParagraph"/>
+        <w:keepLines/>
+        <w:numPr>
+          <w:ilvl w:val="0"/>
+          <w:numId w:val="1"/>
+        </w:numPr>
+        <w:spacing w:before="40" w:after="0" w:line="360" w:lineRule="auto"/>
+        <w:rPr>
+          <w:rFonts w:ascii="Arial" w:hAnsi="Arial" w:cs="Arial"/>
+          <w:sz w:val="22"/>
+          <w:szCs w:val="22"/>
+        </w:rPr>
+      </w:pPr>
+      <w:r>
         <w:rPr>
           <w:rFonts w:ascii="Arial" w:hAnsi="Arial" w:cs="Arial"/>
           <w:sz w:val="22"/>
@@ -1660,6 +941,44 @@
           <w:szCs w:val="22"/>
         </w:rPr>
         <w:t>Buder, S. et al. (2021), ‘The GALAH+ survey: Third data release’, MNRAS, 506, 150. https://doi.org/10.1093/mnras/stab1242</w:t>
+      </w:r>
+    </w:p>
+    <w:p>
+      <w:pPr>
+        <w:pStyle w:val="ListParagraph"/>
+        <w:keepLines/>
+        <w:numPr>
+          <w:ilvl w:val="0"/>
+          <w:numId w:val="1"/>
+        </w:numPr>
+        <w:spacing w:before="40" w:after="0" w:line="360" w:lineRule="auto"/>
+        <w:rPr>
+          <w:rFonts w:ascii="Arial" w:hAnsi="Arial" w:cs="Arial"/>
+          <w:sz w:val="22"/>
+          <w:szCs w:val="22"/>
+        </w:rPr>
+      </w:pPr>
+      <w:r>
+        <w:t>Cooper, A. P. et al. (2023), ‘Overview of the DESI Milky Way Survey’, ApJ, 947, 37. https://doi.org/10.3847/1538-4357/acb3c0</w:t>
+      </w:r>
+    </w:p>
+    <w:p>
+      <w:pPr>
+        <w:pStyle w:val="ListParagraph"/>
+        <w:keepLines/>
+        <w:numPr>
+          <w:ilvl w:val="0"/>
+          <w:numId w:val="1"/>
+        </w:numPr>
+        <w:spacing w:before="40" w:after="0" w:line="360" w:lineRule="auto"/>
+        <w:rPr>
+          <w:rFonts w:ascii="Arial" w:hAnsi="Arial" w:cs="Arial"/>
+          <w:sz w:val="22"/>
+          <w:szCs w:val="22"/>
+        </w:rPr>
+      </w:pPr>
+      <w:r>
+        <w:t>ESA/DPAC, ‘Gaia Data Release 4: content and expected archive products’. https://www.cosmos.esa.int/web/gaia/dr4</w:t>
       </w:r>
     </w:p>
     <w:sectPr>

</xml_diff>

<commit_message>
Add Sarah Kane as supervisor on project 5
</commit_message>
<xml_diff>
--- a/05_Gaia_DR4_Inner_Halo_Substructure_Jacobi_Metallicity.docx
+++ b/05_Gaia_DR4_Inner_Halo_Substructure_Jacobi_Metallicity.docx
@@ -47,6 +47,24 @@
           <w:szCs w:val="22"/>
         </w:rPr>
         <w:t>Supervisor II: Professor Sergey Koposov (skoposov@ed.ac.uk)</w:t>
+      </w:r>
+    </w:p>
+    <w:p>
+      <w:pPr>
+        <w:spacing w:before="40" w:after="0" w:line="360" w:lineRule="auto"/>
+        <w:rPr>
+          <w:rFonts w:ascii="Arial" w:hAnsi="Arial" w:cs="Arial"/>
+          <w:sz w:val="22"/>
+          <w:szCs w:val="22"/>
+        </w:rPr>
+      </w:pPr>
+      <w:r>
+        <w:rPr>
+          <w:rFonts w:ascii="Arial" w:hAnsi="Arial" w:cs="Arial"/>
+          <w:sz w:val="22"/>
+          <w:szCs w:val="22"/>
+        </w:rPr>
+        <w:t>Supervisor III: Sarah Kane (sgk27@cam.ac.uk)</w:t>
       </w:r>
     </w:p>
     <w:p>

</xml_diff>